<commit_message>
MGS-8392 update damp section of mta form
</commit_message>
<xml_diff>
--- a/housing-service/src/main/resources/templates/model-tenancy-agreement-2026.docx
+++ b/housing-service/src/main/resources/templates/model-tenancy-agreement-2026.docx
@@ -19192,7 +19192,14 @@
           <w:rFonts w:cs="Arial"/>
           <w:b/>
         </w:rPr>
-        <w:t>Substantial damp or mould:</w:t>
+        <w:t>Damp</w:t>
+      </w:r>
+      <w:r>
+        <w:rPr>
+          <w:rFonts w:cs="Arial"/>
+          <w:b/>
+        </w:rPr>
+        <w:t xml:space="preserve"> or mould:</w:t>
       </w:r>
     </w:p>
     <w:p>
@@ -19206,33 +19213,313 @@
     </w:p>
     <w:p>
       <w:pPr>
-        <w:pStyle w:val="Heading6"/>
-        <w:rPr>
-          <w:rFonts w:cs="Arial"/>
-          <w:b/>
-        </w:rPr>
-      </w:pPr>
-      <w:r>
-        <w:rPr>
-          <w:rFonts w:cs="Arial"/>
-          <w:b/>
-        </w:rPr>
-        <w:t xml:space="preserve">If during the tenancy, the property suffers from substantial damp or mould, the Landlord must ensure the issue is investigated within 10 working days of being notified. The landlord must provide a written summary of the findings </w:t>
-      </w:r>
-      <w:r>
-        <w:rPr>
-          <w:rFonts w:cs="Arial"/>
-          <w:b/>
+        <w:rPr>
+          <w:rFonts w:cs="Arial"/>
+          <w:b/>
+          <w:sz w:val="24"/>
+          <w:szCs w:val="24"/>
+        </w:rPr>
+      </w:pPr>
+      <w:r>
+        <w:rPr>
+          <w:rFonts w:cs="Arial"/>
+          <w:b/>
+          <w:sz w:val="24"/>
+          <w:szCs w:val="24"/>
+        </w:rPr>
+        <w:t>If the landlord is notified or becomes aware of damp or mould they must</w:t>
+      </w:r>
+    </w:p>
+    <w:p>
+      <w:pPr>
+        <w:rPr>
+          <w:rFonts w:cs="Arial"/>
+          <w:b/>
+          <w:sz w:val="24"/>
+          <w:szCs w:val="24"/>
+        </w:rPr>
+      </w:pPr>
+      <w:r>
+        <w:rPr>
+          <w:rFonts w:cs="Arial"/>
+          <w:b/>
+          <w:sz w:val="24"/>
+          <w:szCs w:val="24"/>
+        </w:rPr>
+        <w:t>ensure the issue is investigated within 10 working days. The landlord must</w:t>
+      </w:r>
+    </w:p>
+    <w:p>
+      <w:pPr>
+        <w:rPr>
+          <w:rFonts w:cs="Arial"/>
+          <w:b/>
+          <w:sz w:val="24"/>
+          <w:szCs w:val="24"/>
+        </w:rPr>
+      </w:pPr>
+      <w:r>
+        <w:rPr>
+          <w:rFonts w:cs="Arial"/>
+          <w:b/>
+          <w:sz w:val="24"/>
+          <w:szCs w:val="24"/>
+        </w:rPr>
+        <w:t>provide a written summary of the findings to the tenant within 3 working days</w:t>
+      </w:r>
+    </w:p>
+    <w:p>
+      <w:pPr>
+        <w:rPr>
+          <w:rFonts w:cs="Arial"/>
+          <w:b/>
+          <w:sz w:val="24"/>
+          <w:szCs w:val="24"/>
+        </w:rPr>
+      </w:pPr>
+      <w:r>
+        <w:rPr>
+          <w:rFonts w:cs="Arial"/>
+          <w:b/>
+          <w:sz w:val="24"/>
+          <w:szCs w:val="24"/>
         </w:rPr>
         <w:lastRenderedPageBreak/>
-        <w:t>within 3 working days of the investigation concluding and commence any required repairs within 5 working days of the investigation concluding.  If, for reasons beyond the Landlord’s control, they cannot comply with the timescales for investigation and commencement of the repair, they must inform the tenant of the new timescales for completion of the investigation and commencement of the repair. Further detail is available on the Scottish Government website.</w:t>
-      </w:r>
-    </w:p>
-    <w:p/>
-    <w:p>
-      <w:pPr>
-        <w:rPr>
-          <w:rFonts w:cs="Arial"/>
+        <w:t>of the investigation concluding.</w:t>
+      </w:r>
+    </w:p>
+    <w:p>
+      <w:pPr>
+        <w:rPr>
+          <w:rFonts w:cs="Arial"/>
+          <w:b/>
+          <w:sz w:val="24"/>
+          <w:szCs w:val="24"/>
+        </w:rPr>
+      </w:pPr>
+    </w:p>
+    <w:p>
+      <w:pPr>
+        <w:rPr>
+          <w:rFonts w:cs="Arial"/>
+          <w:b/>
+          <w:sz w:val="24"/>
+          <w:szCs w:val="24"/>
+        </w:rPr>
+      </w:pPr>
+      <w:r>
+        <w:rPr>
+          <w:rFonts w:cs="Arial"/>
+          <w:b/>
+          <w:sz w:val="24"/>
+          <w:szCs w:val="24"/>
+        </w:rPr>
+        <w:t>If the investigation identifies substantial damp or mould the landlord must</w:t>
+      </w:r>
+    </w:p>
+    <w:p>
+      <w:pPr>
+        <w:rPr>
+          <w:rFonts w:cs="Arial"/>
+          <w:b/>
+          <w:sz w:val="24"/>
+          <w:szCs w:val="24"/>
+        </w:rPr>
+      </w:pPr>
+      <w:r>
+        <w:rPr>
+          <w:rFonts w:cs="Arial"/>
+          <w:b/>
+          <w:sz w:val="24"/>
+          <w:szCs w:val="24"/>
+        </w:rPr>
+        <w:t>commence any required repairs within 5 working days of the investigation</w:t>
+      </w:r>
+    </w:p>
+    <w:p>
+      <w:pPr>
+        <w:rPr>
+          <w:rFonts w:cs="Arial"/>
+          <w:b/>
+          <w:sz w:val="24"/>
+          <w:szCs w:val="24"/>
+        </w:rPr>
+      </w:pPr>
+      <w:r>
+        <w:rPr>
+          <w:rFonts w:cs="Arial"/>
+          <w:b/>
+          <w:sz w:val="24"/>
+          <w:szCs w:val="24"/>
+        </w:rPr>
+        <w:t>concluding.</w:t>
+      </w:r>
+    </w:p>
+    <w:p>
+      <w:pPr>
+        <w:rPr>
+          <w:rFonts w:cs="Arial"/>
+          <w:b/>
+          <w:sz w:val="24"/>
+          <w:szCs w:val="24"/>
+        </w:rPr>
+      </w:pPr>
+    </w:p>
+    <w:p>
+      <w:pPr>
+        <w:rPr>
+          <w:rFonts w:cs="Arial"/>
+          <w:b/>
+          <w:sz w:val="24"/>
+          <w:szCs w:val="24"/>
+        </w:rPr>
+      </w:pPr>
+      <w:r>
+        <w:rPr>
+          <w:rFonts w:cs="Arial"/>
+          <w:b/>
+          <w:sz w:val="24"/>
+          <w:szCs w:val="24"/>
+        </w:rPr>
+        <w:t>If – for reasons beyond the landlord’s control - they cannot comply with the</w:t>
+      </w:r>
+    </w:p>
+    <w:p>
+      <w:pPr>
+        <w:rPr>
+          <w:rFonts w:cs="Arial"/>
+          <w:b/>
+          <w:sz w:val="24"/>
+          <w:szCs w:val="24"/>
+        </w:rPr>
+      </w:pPr>
+      <w:r>
+        <w:rPr>
+          <w:rFonts w:cs="Arial"/>
+          <w:b/>
+          <w:sz w:val="24"/>
+          <w:szCs w:val="24"/>
+        </w:rPr>
+        <w:t>timescales for investigation and commencement of the repair, they must</w:t>
+      </w:r>
+    </w:p>
+    <w:p>
+      <w:pPr>
+        <w:rPr>
+          <w:rFonts w:cs="Arial"/>
+          <w:b/>
+          <w:sz w:val="24"/>
+          <w:szCs w:val="24"/>
+        </w:rPr>
+      </w:pPr>
+      <w:r>
+        <w:rPr>
+          <w:rFonts w:cs="Arial"/>
+          <w:b/>
+          <w:sz w:val="24"/>
+          <w:szCs w:val="24"/>
+        </w:rPr>
+        <w:t>inform the tenant of the new timescales for completion of the investigation</w:t>
+      </w:r>
+    </w:p>
+    <w:p>
+      <w:pPr>
+        <w:rPr>
+          <w:rStyle w:val="Hyperlink"/>
+          <w:rFonts w:cs="Arial"/>
+          <w:b/>
+          <w:sz w:val="24"/>
+          <w:szCs w:val="24"/>
+        </w:rPr>
+      </w:pPr>
+      <w:r>
+        <w:rPr>
+          <w:rFonts w:cs="Arial"/>
+          <w:b/>
+          <w:sz w:val="24"/>
+          <w:szCs w:val="24"/>
+        </w:rPr>
+        <w:t xml:space="preserve">and commencement of the repair. Further detail is available at </w:t>
+      </w:r>
+      <w:r>
+        <w:rPr>
+          <w:rFonts w:cs="Arial"/>
+          <w:b/>
+          <w:sz w:val="24"/>
+          <w:szCs w:val="24"/>
+        </w:rPr>
+        <w:fldChar w:fldCharType="begin"/>
+      </w:r>
+      <w:r>
+        <w:rPr>
+          <w:rFonts w:cs="Arial"/>
+          <w:b/>
+          <w:sz w:val="24"/>
+          <w:szCs w:val="24"/>
+        </w:rPr>
+        <w:instrText>HYPERLINK "https://www.gov.scot/publications/awaabs-law-guidance-landlords-scotland/"</w:instrText>
+      </w:r>
+      <w:r>
+        <w:rPr>
+          <w:rFonts w:cs="Arial"/>
+          <w:b/>
+          <w:sz w:val="24"/>
+          <w:szCs w:val="24"/>
+        </w:rPr>
+      </w:r>
+      <w:r>
+        <w:rPr>
+          <w:rFonts w:cs="Arial"/>
+          <w:b/>
+          <w:sz w:val="24"/>
+          <w:szCs w:val="24"/>
+        </w:rPr>
+        <w:fldChar w:fldCharType="separate"/>
+      </w:r>
+      <w:r>
+        <w:rPr>
+          <w:rStyle w:val="Hyperlink"/>
+          <w:rFonts w:cs="Arial"/>
+          <w:b/>
+          <w:sz w:val="24"/>
+          <w:szCs w:val="24"/>
+        </w:rPr>
+        <w:t>Awaab’s law:</w:t>
+      </w:r>
+    </w:p>
+    <w:p>
+      <w:pPr>
+        <w:rPr>
+          <w:rFonts w:cs="Arial"/>
+          <w:sz w:val="24"/>
+          <w:szCs w:val="24"/>
+        </w:rPr>
+      </w:pPr>
+      <w:r>
+        <w:rPr>
+          <w:rStyle w:val="Hyperlink"/>
+          <w:rFonts w:cs="Arial"/>
+          <w:b/>
+          <w:sz w:val="24"/>
+          <w:szCs w:val="24"/>
+        </w:rPr>
+        <w:t>guide for landlords on gov.scot.</w:t>
+      </w:r>
+      <w:r>
+        <w:rPr>
+          <w:rFonts w:cs="Arial"/>
+          <w:b/>
+          <w:sz w:val="24"/>
+          <w:szCs w:val="24"/>
+        </w:rPr>
+        <w:fldChar w:fldCharType="end"/>
+      </w:r>
+    </w:p>
+    <w:p>
+      <w:pPr>
+        <w:rPr>
+          <w:rFonts w:cs="Arial"/>
+          <w:b/>
           <w:sz w:val="24"/>
           <w:szCs w:val="24"/>
         </w:rPr>
@@ -19932,7 +20219,6 @@
           <w:sz w:val="24"/>
           <w:szCs w:val="24"/>
         </w:rPr>
-        <w:lastRenderedPageBreak/>
         <w:t>The Landlord will keep in repair and in proper working order the installations</w:t>
       </w:r>
       <w:r>
@@ -20713,7 +20999,6 @@
           <w:szCs w:val="24"/>
           <w:lang w:eastAsia="en-GB"/>
         </w:rPr>
-        <w:lastRenderedPageBreak/>
         <w:t>The Tenant undertakes to notify the Landlord as soon as is reasonably practicable of the need for any repair. The Landlord is responsible for ensuring investigation of</w:t>
       </w:r>
       <w:r>
@@ -21425,7 +21710,18 @@
           <w:szCs w:val="24"/>
           <w:lang w:eastAsia="en-GB"/>
         </w:rPr>
-        <w:t>Let Property to see if any such work is needed; and carrying out a valuation of the Let Property.</w:t>
+        <w:t xml:space="preserve">Let Property to see if any such work </w:t>
+      </w:r>
+      <w:r>
+        <w:rPr>
+          <w:rFonts w:cs="Arial"/>
+          <w:b/>
+          <w:sz w:val="24"/>
+          <w:szCs w:val="24"/>
+          <w:lang w:eastAsia="en-GB"/>
+        </w:rPr>
+        <w:lastRenderedPageBreak/>
+        <w:t>is needed; and carrying out a valuation of the Let Property.</w:t>
       </w:r>
       <w:r>
         <w:rPr>
@@ -22301,6 +22597,7 @@
           <w:sz w:val="24"/>
           <w:szCs w:val="24"/>
         </w:rPr>
+        <w:lastRenderedPageBreak/>
         <w:t>store or bring onto the premises any type of unlicensed firearm or firearm ammunition including any</w:t>
       </w:r>
       <w:r>
@@ -22342,7 +22639,6 @@
           <w:sz w:val="24"/>
           <w:szCs w:val="24"/>
         </w:rPr>
-        <w:lastRenderedPageBreak/>
         <w:t xml:space="preserve">use the Let Property or allow it to be used, for illegal </w:t>
       </w:r>
       <w:r>
@@ -23114,6 +23410,7 @@
           <w:sz w:val="24"/>
           <w:szCs w:val="24"/>
         </w:rPr>
+        <w:lastRenderedPageBreak/>
         <w:t>The Landlord giving notice to the Tenant</w:t>
       </w:r>
       <w:r>
@@ -25203,6 +25500,7 @@
           <w:b/>
           <w:szCs w:val="24"/>
         </w:rPr>
+        <w:lastRenderedPageBreak/>
         <w:t xml:space="preserve">The tenancy was entered into on account of the </w:t>
       </w:r>
       <w:r>
@@ -25292,7 +25590,6 @@
           <w:b/>
           <w:szCs w:val="24"/>
         </w:rPr>
-        <w:lastRenderedPageBreak/>
         <w:t xml:space="preserve">The </w:t>
       </w:r>
       <w:r>
@@ -26022,6 +26319,7 @@
           <w:b/>
           <w:szCs w:val="24"/>
         </w:rPr>
+        <w:lastRenderedPageBreak/>
         <w:t xml:space="preserve">The tenancy was granted to an employee and the </w:t>
       </w:r>
       <w:r>
@@ -26069,7 +26367,6 @@
           <w:sz w:val="24"/>
           <w:szCs w:val="24"/>
         </w:rPr>
-        <w:lastRenderedPageBreak/>
         <w:t>The Tenant agrees to remove all of his or her belongings when the Tenancy</w:t>
       </w:r>
       <w:r>
@@ -28380,6 +28677,7 @@
           <w:sz w:val="24"/>
           <w:szCs w:val="24"/>
         </w:rPr>
+        <w:lastRenderedPageBreak/>
         <w:t>h</w:t>
       </w:r>
       <w:r>
@@ -28441,7 +28739,6 @@
           <w:sz w:val="24"/>
           <w:szCs w:val="24"/>
         </w:rPr>
-        <w:lastRenderedPageBreak/>
         <w:t>has not knowingly or carelessly made any false or misleading statements</w:t>
       </w:r>
       <w:r>
@@ -66988,6 +67285,7 @@
   <w:style w:type="character" w:default="1" w:styleId="DefaultParagraphFont">
     <w:name w:val="Default Paragraph Font"/>
     <w:uiPriority w:val="1"/>
+    <w:semiHidden/>
     <w:unhideWhenUsed/>
   </w:style>
   <w:style w:type="table" w:default="1" w:styleId="TableNormal">

</xml_diff>